<commit_message>
CI guard: one Python check whose exit code decides (tracked data/outputs/logs folders, DB files, .env files and key names in the tree and every commit), with tests on both OS; Excel cover shows the company's market and the beta table its index
</commit_message>
<xml_diff>
--- a/examples/035610_sotp_associate/035610_report_draft_example.docx
+++ b/examples/035610_sotp_associate/035610_report_draft_example.docx
@@ -4761,7 +4761,7 @@
               <w:rPr>
                 <w:sz w:val="17"/>
               </w:rPr>
-              <w:t>C:/Users/Mevius/AppData/Local/Temp/kvi_p7d_yzdskxji/ws/sessions/035610_20260930_001/v1_public/valuation_035610_035610_20260930_001v1p.yaml beta.tax</w:t>
+              <w:t>C:/Users/Mevius/AppData/Local/Temp/kvi_p7d_dta74qf4/ws/sessions/035610_20260930_001/v1_public/valuation_035610_035610_20260930_001v1p.yaml beta.tax</w:t>
             </w:r>
           </w:p>
         </w:tc>
@@ -4839,7 +4839,7 @@
               <w:rPr>
                 <w:sz w:val="17"/>
               </w:rPr>
-              <w:t>C:/Users/Mevius/AppData/Local/Temp/kvi_p7d_yzdskxji/ws/sessions/035610_20260930_001/v1_public/valuation_035610_035610_20260930_001v1p.yaml (공개 모드 집계 입력)</w:t>
+              <w:t>C:/Users/Mevius/AppData/Local/Temp/kvi_p7d_dta74qf4/ws/sessions/035610_20260930_001/v1_public/valuation_035610_035610_20260930_001v1p.yaml (공개 모드 집계 입력)</w:t>
             </w:r>
           </w:p>
         </w:tc>
@@ -12449,7 +12449,7 @@
               <w:rPr>
                 <w:sz w:val="17"/>
               </w:rPr>
-              <w:t>C:/Users/Mevius/AppData/Local/Temp/kvi_p7d_yzdskxji/ws/sessions/035610_20260930_001/v1_public/valuation_035610_035610_20260930_001v1p.yaml excel.default_scenario</w:t>
+              <w:t>C:/Users/Mevius/AppData/Local/Temp/kvi_p7d_dta74qf4/ws/sessions/035610_20260930_001/v1_public/valuation_035610_035610_20260930_001v1p.yaml excel.default_scenario</w:t>
             </w:r>
           </w:p>
         </w:tc>
@@ -12613,7 +12613,7 @@
               <w:rPr>
                 <w:sz w:val="17"/>
               </w:rPr>
-              <w:t>C:/Users/Mevius/AppData/Local/Temp/kvi_p7d_yzdskxji/ws/sessions/035610_20260930_001/v1_public/valuation_035610_035610_20260930_001v1p.yaml meta.as_of</w:t>
+              <w:t>C:/Users/Mevius/AppData/Local/Temp/kvi_p7d_dta74qf4/ws/sessions/035610_20260930_001/v1_public/valuation_035610_035610_20260930_001v1p.yaml meta.as_of</w:t>
             </w:r>
           </w:p>
         </w:tc>
@@ -12654,7 +12654,7 @@
               <w:rPr>
                 <w:sz w:val="17"/>
               </w:rPr>
-              <w:t>C:/Users/Mevius/AppData/Local/Temp/kvi_p7d_yzdskxji/ws/sessions/035610_20260930_001/v1_public/valuation_035610_035610_20260930_001v1p.yaml meta.bs_date</w:t>
+              <w:t>C:/Users/Mevius/AppData/Local/Temp/kvi_p7d_dta74qf4/ws/sessions/035610_20260930_001/v1_public/valuation_035610_035610_20260930_001v1p.yaml meta.bs_date</w:t>
             </w:r>
           </w:p>
         </w:tc>
@@ -12695,7 +12695,7 @@
               <w:rPr>
                 <w:sz w:val="17"/>
               </w:rPr>
-              <w:t>C:/Users/Mevius/AppData/Local/Temp/kvi_p7d_yzdskxji/ws/sessions/035610_20260930_001/v1_public/valuation_035610_035610_20260930_001v1p.yaml meta.bs_date + 1일</w:t>
+              <w:t>C:/Users/Mevius/AppData/Local/Temp/kvi_p7d_dta74qf4/ws/sessions/035610_20260930_001/v1_public/valuation_035610_035610_20260930_001v1p.yaml meta.bs_date + 1일</w:t>
             </w:r>
           </w:p>
         </w:tc>
@@ -12736,7 +12736,7 @@
               <w:rPr>
                 <w:sz w:val="17"/>
               </w:rPr>
-              <w:t>C:/Users/Mevius/AppData/Local/Temp/kvi_p7d_yzdskxji/ws/sessions/035610_20260930_001/v1_public/valuation_035610_035610_20260930_001v1p.yaml forecast.mid_year</w:t>
+              <w:t>C:/Users/Mevius/AppData/Local/Temp/kvi_p7d_dta74qf4/ws/sessions/035610_20260930_001/v1_public/valuation_035610_035610_20260930_001v1p.yaml forecast.mid_year</w:t>
             </w:r>
           </w:p>
         </w:tc>
@@ -12777,7 +12777,7 @@
               <w:rPr>
                 <w:sz w:val="17"/>
               </w:rPr>
-              <w:t>C:/Users/Mevius/AppData/Local/Temp/kvi_p7d_yzdskxji/ws/sessions/035610_20260930_001/v1_public/valuation_035610_035610_20260930_001v1p.yaml structure (규칙 판정)</w:t>
+              <w:t>C:/Users/Mevius/AppData/Local/Temp/kvi_p7d_dta74qf4/ws/sessions/035610_20260930_001/v1_public/valuation_035610_035610_20260930_001v1p.yaml structure (규칙 판정)</w:t>
             </w:r>
           </w:p>
         </w:tc>
@@ -12941,7 +12941,7 @@
               <w:rPr>
                 <w:sz w:val="17"/>
               </w:rPr>
-              <w:t>C:/Users/Mevius/AppData/Local/Temp/kvi_p7d_yzdskxji/ws/sessions/035610_20260930_001/v1_public/valuation_035610_035610_20260930_001v1p.yaml beta.tax</w:t>
+              <w:t>C:/Users/Mevius/AppData/Local/Temp/kvi_p7d_dta74qf4/ws/sessions/035610_20260930_001/v1_public/valuation_035610_035610_20260930_001v1p.yaml beta.tax</w:t>
             </w:r>
           </w:p>
         </w:tc>
@@ -13064,7 +13064,7 @@
               <w:rPr>
                 <w:sz w:val="17"/>
               </w:rPr>
-              <w:t>C:/Users/Mevius/AppData/Local/Temp/kvi_p7d_yzdskxji/ws/sessions/035610_20260930_001/v1_public/valuation_035610_035610_20260930_001v1p.yaml (공개 모드 집계 입력)</w:t>
+              <w:t>C:/Users/Mevius/AppData/Local/Temp/kvi_p7d_dta74qf4/ws/sessions/035610_20260930_001/v1_public/valuation_035610_035610_20260930_001v1p.yaml (공개 모드 집계 입력)</w:t>
             </w:r>
           </w:p>
         </w:tc>
@@ -13105,7 +13105,7 @@
               <w:rPr>
                 <w:sz w:val="17"/>
               </w:rPr>
-              <w:t>C:/Users/Mevius/AppData/Local/Temp/kvi_p7d_yzdskxji/ws/sessions/035610_20260930_001/v1_public/valuation_035610_035610_20260930_001v1p.yaml structure.listed_subsidiary (otrCprInvstmntSttus)</w:t>
+              <w:t>C:/Users/Mevius/AppData/Local/Temp/kvi_p7d_dta74qf4/ws/sessions/035610_20260930_001/v1_public/valuation_035610_035610_20260930_001v1p.yaml structure.listed_subsidiary (otrCprInvstmntSttus)</w:t>
             </w:r>
           </w:p>
         </w:tc>
@@ -13146,7 +13146,7 @@
               <w:rPr>
                 <w:sz w:val="17"/>
               </w:rPr>
-              <w:t>C:/Users/Mevius/AppData/Local/Temp/kvi_p7d_yzdskxji/ws/sessions/035610_20260930_001/v1_public/valuation_035610_035610_20260930_001v1p.yaml forecast.human.g_terminal</w:t>
+              <w:t>C:/Users/Mevius/AppData/Local/Temp/kvi_p7d_dta74qf4/ws/sessions/035610_20260930_001/v1_public/valuation_035610_035610_20260930_001v1p.yaml forecast.human.g_terminal</w:t>
             </w:r>
           </w:p>
         </w:tc>
@@ -13187,7 +13187,7 @@
               <w:rPr>
                 <w:sz w:val="17"/>
               </w:rPr>
-              <w:t>C:/Users/Mevius/AppData/Local/Temp/kvi_p7d_yzdskxji/ws/sessions/035610_20260930_001/v1_public/valuation_035610_035610_20260930_001v1p.yaml params.fade_to_terminal_by</w:t>
+              <w:t>C:/Users/Mevius/AppData/Local/Temp/kvi_p7d_dta74qf4/ws/sessions/035610_20260930_001/v1_public/valuation_035610_035610_20260930_001v1p.yaml params.fade_to_terminal_by</w:t>
             </w:r>
           </w:p>
         </w:tc>
@@ -13228,7 +13228,7 @@
               <w:rPr>
                 <w:sz w:val="17"/>
               </w:rPr>
-              <w:t>C:/Users/Mevius/AppData/Local/Temp/kvi_p7d_yzdskxji/ws/sessions/035610_20260930_001/v1_public/valuation_035610_035610_20260930_001v1p.yaml params.ebitda_rule</w:t>
+              <w:t>C:/Users/Mevius/AppData/Local/Temp/kvi_p7d_dta74qf4/ws/sessions/035610_20260930_001/v1_public/valuation_035610_035610_20260930_001v1p.yaml params.ebitda_rule</w:t>
             </w:r>
           </w:p>
         </w:tc>
@@ -13269,7 +13269,7 @@
               <w:rPr>
                 <w:sz w:val="17"/>
               </w:rPr>
-              <w:t>C:/Users/Mevius/AppData/Local/Temp/kvi_p7d_yzdskxji/ws/sessions/035610_20260930_001/v1_public/valuation_035610_035610_20260930_001v1p.yaml params.ebitda_rule</w:t>
+              <w:t>C:/Users/Mevius/AppData/Local/Temp/kvi_p7d_dta74qf4/ws/sessions/035610_20260930_001/v1_public/valuation_035610_035610_20260930_001v1p.yaml params.ebitda_rule</w:t>
             </w:r>
           </w:p>
         </w:tc>
@@ -13310,7 +13310,7 @@
               <w:rPr>
                 <w:sz w:val="17"/>
               </w:rPr>
-              <w:t>C:/Users/Mevius/AppData/Local/Temp/kvi_p7d_yzdskxji/ws/sessions/035610_20260930_001/v1_public/valuation_035610_035610_20260930_001v1p.yaml params.ebitda_rule</w:t>
+              <w:t>C:/Users/Mevius/AppData/Local/Temp/kvi_p7d_dta74qf4/ws/sessions/035610_20260930_001/v1_public/valuation_035610_035610_20260930_001v1p.yaml params.ebitda_rule</w:t>
             </w:r>
           </w:p>
         </w:tc>
@@ -13351,7 +13351,7 @@
               <w:rPr>
                 <w:sz w:val="17"/>
               </w:rPr>
-              <w:t>C:/Users/Mevius/AppData/Local/Temp/kvi_p7d_yzdskxji/ws/sessions/035610_20260930_001/v1_public/valuation_035610_035610_20260930_001v1p.yaml params.ebitda_rule</w:t>
+              <w:t>C:/Users/Mevius/AppData/Local/Temp/kvi_p7d_dta74qf4/ws/sessions/035610_20260930_001/v1_public/valuation_035610_035610_20260930_001v1p.yaml params.ebitda_rule</w:t>
             </w:r>
           </w:p>
         </w:tc>
@@ -13392,7 +13392,7 @@
               <w:rPr>
                 <w:sz w:val="17"/>
               </w:rPr>
-              <w:t>C:/Users/Mevius/AppData/Local/Temp/kvi_p7d_yzdskxji/ws/sessions/035610_20260930_001/v1_public/valuation_035610_035610_20260930_001v1p.yaml structure.segments</w:t>
+              <w:t>C:/Users/Mevius/AppData/Local/Temp/kvi_p7d_dta74qf4/ws/sessions/035610_20260930_001/v1_public/valuation_035610_035610_20260930_001v1p.yaml structure.segments</w:t>
             </w:r>
           </w:p>
         </w:tc>
@@ -13433,7 +13433,7 @@
               <w:rPr>
                 <w:sz w:val="17"/>
               </w:rPr>
-              <w:t>C:/Users/Mevius/AppData/Local/Temp/kvi_p7d_yzdskxji/ws/sessions/035610_20260930_001/v1_public/valuation_035610_035610_20260930_001v1p.yaml structure.segments</w:t>
+              <w:t>C:/Users/Mevius/AppData/Local/Temp/kvi_p7d_dta74qf4/ws/sessions/035610_20260930_001/v1_public/valuation_035610_035610_20260930_001v1p.yaml structure.segments</w:t>
             </w:r>
           </w:p>
         </w:tc>
@@ -13802,7 +13802,7 @@
               <w:rPr>
                 <w:sz w:val="17"/>
               </w:rPr>
-              <w:t>C:/Users/Mevius/AppData/Local/Temp/kvi_p7d_yzdskxji/ws/sessions/035610_20260930_001/v1_public/valuation_035610_035610_20260930_001v1p.yaml meta.target.market</w:t>
+              <w:t>C:/Users/Mevius/AppData/Local/Temp/kvi_p7d_dta74qf4/ws/sessions/035610_20260930_001/v1_public/valuation_035610_035610_20260930_001v1p.yaml meta.target.market</w:t>
             </w:r>
           </w:p>
         </w:tc>
@@ -13925,7 +13925,7 @@
               <w:rPr>
                 <w:sz w:val="17"/>
               </w:rPr>
-              <w:t>C:/Users/Mevius/AppData/Local/Temp/kvi_p7d_yzdskxji/ws/sessions/035610_20260930_001/v1_public/valuation_035610_035610_20260930_001v1p.yaml relative.n_warn</w:t>
+              <w:t>C:/Users/Mevius/AppData/Local/Temp/kvi_p7d_dta74qf4/ws/sessions/035610_20260930_001/v1_public/valuation_035610_035610_20260930_001v1p.yaml relative.n_warn</w:t>
             </w:r>
           </w:p>
         </w:tc>

</xml_diff>

<commit_message>
Validation republished with the final re-check holdout (pass 8 / below 4 / not measured 1, as measured); check-cell formulas never show an error on N/M (fixed after the measurement, values unchanged); known issues with status; methodology adds listing checks, share-event window, candidate ranges and reconciliation tolerances; snapshots and examples rebuilt
</commit_message>
<xml_diff>
--- a/examples/035610_sotp_associate/035610_report_draft_example.docx
+++ b/examples/035610_sotp_associate/035610_report_draft_example.docx
@@ -2415,7 +2415,7 @@
               <w:rPr>
                 <w:sz w:val="17"/>
               </w:rPr>
-              <w:t>LTM 이익률 출발 → 주당 7,656원</w:t>
+              <w:t>후보 없음(범위 밖: -101.40%)</w:t>
             </w:r>
           </w:p>
         </w:tc>
@@ -2428,7 +2428,7 @@
               <w:rPr>
                 <w:sz w:val="17"/>
               </w:rPr>
-              <w:t>-1,078</w:t>
+              <w:t>n/a</w:t>
             </w:r>
           </w:p>
         </w:tc>
@@ -2441,7 +2441,7 @@
               <w:rPr>
                 <w:sz w:val="17"/>
               </w:rPr>
-              <w:t>-12.3%</w:t>
+              <w:t>n/a</w:t>
             </w:r>
           </w:p>
         </w:tc>
@@ -2694,7 +2694,7 @@
           <w:i w:val="0"/>
           <w:sz w:val="18"/>
         </w:rPr>
-        <w:t>나머지 계산 항목 15개와 계산할 수 없는 항목 24개는 엑셀 Diagnostics G표에 있다.</w:t>
+        <w:t>나머지 계산 항목 14개와 계산할 수 없는 항목 25개는 엑셀 Diagnostics G표에 있다.</w:t>
       </w:r>
     </w:p>
     <w:p>
@@ -4761,7 +4761,7 @@
               <w:rPr>
                 <w:sz w:val="17"/>
               </w:rPr>
-              <w:t>C:/Users/Mevius/AppData/Local/Temp/kvi_p7d_dta74qf4/ws/sessions/035610_20260930_001/v1_public/valuation_035610_035610_20260930_001v1p.yaml beta.tax</w:t>
+              <w:t>공개 배포 작업 공간/sessions/035610_20260930_001/v1_public/valuation_035610_035610_20260930_001v1p.yaml beta.tax</w:t>
             </w:r>
           </w:p>
         </w:tc>
@@ -4839,7 +4839,7 @@
               <w:rPr>
                 <w:sz w:val="17"/>
               </w:rPr>
-              <w:t>C:/Users/Mevius/AppData/Local/Temp/kvi_p7d_dta74qf4/ws/sessions/035610_20260930_001/v1_public/valuation_035610_035610_20260930_001v1p.yaml (공개 모드 집계 입력)</w:t>
+              <w:t>공개 배포 작업 공간/sessions/035610_20260930_001/v1_public/valuation_035610_035610_20260930_001v1p.yaml (공개 모드 집계 입력)</w:t>
             </w:r>
           </w:p>
         </w:tc>
@@ -12331,7 +12331,7 @@
         <w:rPr>
           <w:i w:val="0"/>
         </w:rPr>
-        <w:t>master check: OK · N/A 4 / OK 62 / WARN 3</w:t>
+        <w:t>master check: OK · N/A 1 / N/M 3 / OK 62 / WARN 3</w:t>
       </w:r>
     </w:p>
     <w:p>
@@ -12449,7 +12449,7 @@
               <w:rPr>
                 <w:sz w:val="17"/>
               </w:rPr>
-              <w:t>C:/Users/Mevius/AppData/Local/Temp/kvi_p7d_dta74qf4/ws/sessions/035610_20260930_001/v1_public/valuation_035610_035610_20260930_001v1p.yaml excel.default_scenario</w:t>
+              <w:t>공개 배포 작업 공간/sessions/035610_20260930_001/v1_public/valuation_035610_035610_20260930_001v1p.yaml excel.default_scenario</w:t>
             </w:r>
           </w:p>
         </w:tc>
@@ -12613,7 +12613,7 @@
               <w:rPr>
                 <w:sz w:val="17"/>
               </w:rPr>
-              <w:t>C:/Users/Mevius/AppData/Local/Temp/kvi_p7d_dta74qf4/ws/sessions/035610_20260930_001/v1_public/valuation_035610_035610_20260930_001v1p.yaml meta.as_of</w:t>
+              <w:t>공개 배포 작업 공간/sessions/035610_20260930_001/v1_public/valuation_035610_035610_20260930_001v1p.yaml meta.as_of</w:t>
             </w:r>
           </w:p>
         </w:tc>
@@ -12654,7 +12654,7 @@
               <w:rPr>
                 <w:sz w:val="17"/>
               </w:rPr>
-              <w:t>C:/Users/Mevius/AppData/Local/Temp/kvi_p7d_dta74qf4/ws/sessions/035610_20260930_001/v1_public/valuation_035610_035610_20260930_001v1p.yaml meta.bs_date</w:t>
+              <w:t>공개 배포 작업 공간/sessions/035610_20260930_001/v1_public/valuation_035610_035610_20260930_001v1p.yaml meta.bs_date</w:t>
             </w:r>
           </w:p>
         </w:tc>
@@ -12695,7 +12695,7 @@
               <w:rPr>
                 <w:sz w:val="17"/>
               </w:rPr>
-              <w:t>C:/Users/Mevius/AppData/Local/Temp/kvi_p7d_dta74qf4/ws/sessions/035610_20260930_001/v1_public/valuation_035610_035610_20260930_001v1p.yaml meta.bs_date + 1일</w:t>
+              <w:t>공개 배포 작업 공간/sessions/035610_20260930_001/v1_public/valuation_035610_035610_20260930_001v1p.yaml meta.bs_date + 1일</w:t>
             </w:r>
           </w:p>
         </w:tc>
@@ -12736,7 +12736,7 @@
               <w:rPr>
                 <w:sz w:val="17"/>
               </w:rPr>
-              <w:t>C:/Users/Mevius/AppData/Local/Temp/kvi_p7d_dta74qf4/ws/sessions/035610_20260930_001/v1_public/valuation_035610_035610_20260930_001v1p.yaml forecast.mid_year</w:t>
+              <w:t>공개 배포 작업 공간/sessions/035610_20260930_001/v1_public/valuation_035610_035610_20260930_001v1p.yaml forecast.mid_year</w:t>
             </w:r>
           </w:p>
         </w:tc>
@@ -12777,7 +12777,7 @@
               <w:rPr>
                 <w:sz w:val="17"/>
               </w:rPr>
-              <w:t>C:/Users/Mevius/AppData/Local/Temp/kvi_p7d_dta74qf4/ws/sessions/035610_20260930_001/v1_public/valuation_035610_035610_20260930_001v1p.yaml structure (규칙 판정)</w:t>
+              <w:t>공개 배포 작업 공간/sessions/035610_20260930_001/v1_public/valuation_035610_035610_20260930_001v1p.yaml structure (규칙 판정)</w:t>
             </w:r>
           </w:p>
         </w:tc>
@@ -12941,7 +12941,7 @@
               <w:rPr>
                 <w:sz w:val="17"/>
               </w:rPr>
-              <w:t>C:/Users/Mevius/AppData/Local/Temp/kvi_p7d_dta74qf4/ws/sessions/035610_20260930_001/v1_public/valuation_035610_035610_20260930_001v1p.yaml beta.tax</w:t>
+              <w:t>공개 배포 작업 공간/sessions/035610_20260930_001/v1_public/valuation_035610_035610_20260930_001v1p.yaml beta.tax</w:t>
             </w:r>
           </w:p>
         </w:tc>
@@ -13064,7 +13064,7 @@
               <w:rPr>
                 <w:sz w:val="17"/>
               </w:rPr>
-              <w:t>C:/Users/Mevius/AppData/Local/Temp/kvi_p7d_dta74qf4/ws/sessions/035610_20260930_001/v1_public/valuation_035610_035610_20260930_001v1p.yaml (공개 모드 집계 입력)</w:t>
+              <w:t>공개 배포 작업 공간/sessions/035610_20260930_001/v1_public/valuation_035610_035610_20260930_001v1p.yaml (공개 모드 집계 입력)</w:t>
             </w:r>
           </w:p>
         </w:tc>
@@ -13105,7 +13105,7 @@
               <w:rPr>
                 <w:sz w:val="17"/>
               </w:rPr>
-              <w:t>C:/Users/Mevius/AppData/Local/Temp/kvi_p7d_dta74qf4/ws/sessions/035610_20260930_001/v1_public/valuation_035610_035610_20260930_001v1p.yaml structure.listed_subsidiary (otrCprInvstmntSttus)</w:t>
+              <w:t>공개 배포 작업 공간/sessions/035610_20260930_001/v1_public/valuation_035610_035610_20260930_001v1p.yaml structure.listed_subsidiary (otrCprInvstmntSttus)</w:t>
             </w:r>
           </w:p>
         </w:tc>
@@ -13146,7 +13146,7 @@
               <w:rPr>
                 <w:sz w:val="17"/>
               </w:rPr>
-              <w:t>C:/Users/Mevius/AppData/Local/Temp/kvi_p7d_dta74qf4/ws/sessions/035610_20260930_001/v1_public/valuation_035610_035610_20260930_001v1p.yaml forecast.human.g_terminal</w:t>
+              <w:t>공개 배포 작업 공간/sessions/035610_20260930_001/v1_public/valuation_035610_035610_20260930_001v1p.yaml forecast.human.g_terminal</w:t>
             </w:r>
           </w:p>
         </w:tc>
@@ -13187,7 +13187,7 @@
               <w:rPr>
                 <w:sz w:val="17"/>
               </w:rPr>
-              <w:t>C:/Users/Mevius/AppData/Local/Temp/kvi_p7d_dta74qf4/ws/sessions/035610_20260930_001/v1_public/valuation_035610_035610_20260930_001v1p.yaml params.fade_to_terminal_by</w:t>
+              <w:t>공개 배포 작업 공간/sessions/035610_20260930_001/v1_public/valuation_035610_035610_20260930_001v1p.yaml params.fade_to_terminal_by</w:t>
             </w:r>
           </w:p>
         </w:tc>
@@ -13228,7 +13228,7 @@
               <w:rPr>
                 <w:sz w:val="17"/>
               </w:rPr>
-              <w:t>C:/Users/Mevius/AppData/Local/Temp/kvi_p7d_dta74qf4/ws/sessions/035610_20260930_001/v1_public/valuation_035610_035610_20260930_001v1p.yaml params.ebitda_rule</w:t>
+              <w:t>공개 배포 작업 공간/sessions/035610_20260930_001/v1_public/valuation_035610_035610_20260930_001v1p.yaml params.ebitda_rule</w:t>
             </w:r>
           </w:p>
         </w:tc>
@@ -13269,7 +13269,7 @@
               <w:rPr>
                 <w:sz w:val="17"/>
               </w:rPr>
-              <w:t>C:/Users/Mevius/AppData/Local/Temp/kvi_p7d_dta74qf4/ws/sessions/035610_20260930_001/v1_public/valuation_035610_035610_20260930_001v1p.yaml params.ebitda_rule</w:t>
+              <w:t>공개 배포 작업 공간/sessions/035610_20260930_001/v1_public/valuation_035610_035610_20260930_001v1p.yaml params.ebitda_rule</w:t>
             </w:r>
           </w:p>
         </w:tc>
@@ -13310,7 +13310,7 @@
               <w:rPr>
                 <w:sz w:val="17"/>
               </w:rPr>
-              <w:t>C:/Users/Mevius/AppData/Local/Temp/kvi_p7d_dta74qf4/ws/sessions/035610_20260930_001/v1_public/valuation_035610_035610_20260930_001v1p.yaml params.ebitda_rule</w:t>
+              <w:t>공개 배포 작업 공간/sessions/035610_20260930_001/v1_public/valuation_035610_035610_20260930_001v1p.yaml params.ebitda_rule</w:t>
             </w:r>
           </w:p>
         </w:tc>
@@ -13351,7 +13351,7 @@
               <w:rPr>
                 <w:sz w:val="17"/>
               </w:rPr>
-              <w:t>C:/Users/Mevius/AppData/Local/Temp/kvi_p7d_dta74qf4/ws/sessions/035610_20260930_001/v1_public/valuation_035610_035610_20260930_001v1p.yaml params.ebitda_rule</w:t>
+              <w:t>공개 배포 작업 공간/sessions/035610_20260930_001/v1_public/valuation_035610_035610_20260930_001v1p.yaml params.ebitda_rule</w:t>
             </w:r>
           </w:p>
         </w:tc>
@@ -13392,7 +13392,7 @@
               <w:rPr>
                 <w:sz w:val="17"/>
               </w:rPr>
-              <w:t>C:/Users/Mevius/AppData/Local/Temp/kvi_p7d_dta74qf4/ws/sessions/035610_20260930_001/v1_public/valuation_035610_035610_20260930_001v1p.yaml structure.segments</w:t>
+              <w:t>공개 배포 작업 공간/sessions/035610_20260930_001/v1_public/valuation_035610_035610_20260930_001v1p.yaml structure.segments</w:t>
             </w:r>
           </w:p>
         </w:tc>
@@ -13433,7 +13433,7 @@
               <w:rPr>
                 <w:sz w:val="17"/>
               </w:rPr>
-              <w:t>C:/Users/Mevius/AppData/Local/Temp/kvi_p7d_dta74qf4/ws/sessions/035610_20260930_001/v1_public/valuation_035610_035610_20260930_001v1p.yaml structure.segments</w:t>
+              <w:t>공개 배포 작업 공간/sessions/035610_20260930_001/v1_public/valuation_035610_035610_20260930_001v1p.yaml structure.segments</w:t>
             </w:r>
           </w:p>
         </w:tc>
@@ -13802,7 +13802,7 @@
               <w:rPr>
                 <w:sz w:val="17"/>
               </w:rPr>
-              <w:t>C:/Users/Mevius/AppData/Local/Temp/kvi_p7d_dta74qf4/ws/sessions/035610_20260930_001/v1_public/valuation_035610_035610_20260930_001v1p.yaml meta.target.market</w:t>
+              <w:t>공개 배포 작업 공간/sessions/035610_20260930_001/v1_public/valuation_035610_035610_20260930_001v1p.yaml meta.target.market</w:t>
             </w:r>
           </w:p>
         </w:tc>
@@ -13925,7 +13925,7 @@
               <w:rPr>
                 <w:sz w:val="17"/>
               </w:rPr>
-              <w:t>C:/Users/Mevius/AppData/Local/Temp/kvi_p7d_dta74qf4/ws/sessions/035610_20260930_001/v1_public/valuation_035610_035610_20260930_001v1p.yaml relative.n_warn</w:t>
+              <w:t>공개 배포 작업 공간/sessions/035610_20260930_001/v1_public/valuation_035610_035610_20260930_001v1p.yaml relative.n_warn</w:t>
             </w:r>
           </w:p>
         </w:tc>

</xml_diff>